<commit_message>
Polish public assets and authorship
</commit_message>
<xml_diff>
--- a/docs/outputs/loneliness_risk_research_report.docx
+++ b/docs/outputs/loneliness_risk_research_report.docx
@@ -41,6 +41,20 @@
           <w:sz w:val="24"/>
         </w:rPr>
         <w:t>A research-product system for measuring how perceived isolation relates to immediate rewards, impulsive spending, risky choice, and conflict response.</w:t>
+      </w:r>
+    </w:p>
+    <w:p>
+      <w:pPr>
+        <w:jc w:val="center"/>
+      </w:pPr>
+      <w:r>
+        <w:rPr>
+          <w:rFonts w:ascii="Calibri" w:hAnsi="Calibri"/>
+          <w:b/>
+          <w:color w:val="0F766E"/>
+          <w:sz w:val="22"/>
+        </w:rPr>
+        <w:t>Developed by He Haoze (何昊泽)</w:t>
       </w:r>
     </w:p>
     <w:tbl>
@@ -107,6 +121,60 @@
                 <w:sz w:val="19"/>
               </w:rPr>
               <w:t>Value</w:t>
+            </w:r>
+          </w:p>
+        </w:tc>
+      </w:tr>
+      <w:tr>
+        <w:tc>
+          <w:tcPr>
+            <w:tcW w:type="dxa" w:w="2520"/>
+            <w:vAlign w:val="center"/>
+            <w:tcMar>
+              <w:top w:w="80" w:type="dxa"/>
+              <w:start w:w="120" w:type="dxa"/>
+              <w:bottom w:w="80" w:type="dxa"/>
+              <w:end w:w="120" w:type="dxa"/>
+            </w:tcMar>
+          </w:tcPr>
+          <w:p>
+            <w:pPr>
+              <w:spacing w:before="0" w:after="60" w:line="269" w:lineRule="auto"/>
+            </w:pPr>
+            <w:r>
+              <w:rPr>
+                <w:rFonts w:ascii="Calibri" w:hAnsi="Calibri"/>
+                <w:b w:val="0"/>
+                <w:color w:val="122033"/>
+                <w:sz w:val="19"/>
+              </w:rPr>
+              <w:t>Developer</w:t>
+            </w:r>
+          </w:p>
+        </w:tc>
+        <w:tc>
+          <w:tcPr>
+            <w:tcW w:type="dxa" w:w="6840"/>
+            <w:vAlign w:val="center"/>
+            <w:tcMar>
+              <w:top w:w="80" w:type="dxa"/>
+              <w:start w:w="120" w:type="dxa"/>
+              <w:bottom w:w="80" w:type="dxa"/>
+              <w:end w:w="120" w:type="dxa"/>
+            </w:tcMar>
+          </w:tcPr>
+          <w:p>
+            <w:pPr>
+              <w:spacing w:before="0" w:after="60" w:line="269" w:lineRule="auto"/>
+            </w:pPr>
+            <w:r>
+              <w:rPr>
+                <w:rFonts w:ascii="Calibri" w:hAnsi="Calibri"/>
+                <w:b w:val="0"/>
+                <w:color w:val="122033"/>
+                <w:sz w:val="19"/>
+              </w:rPr>
+              <w:t>He Haoze (何昊泽)</w:t>
             </w:r>
           </w:p>
         </w:tc>
@@ -268,7 +336,7 @@
                 <w:color w:val="122033"/>
                 <w:sz w:val="19"/>
               </w:rPr>
-              <w:t>https://taste-empire-come-advancement.trycloudflare.com/survey</w:t>
+              <w:t>https://haobosun940-crypto.github.io/loneliness-risk-decision-lab/survey</w:t>
             </w:r>
           </w:p>
         </w:tc>
@@ -3385,7 +3453,7 @@
             <w:color w:val="1155CC"/>
             <w:u w:val="single"/>
           </w:rPr>
-          <w:t>https://taste-empire-come-advancement.trycloudflare.com/survey</w:t>
+          <w:t>https://haobosun940-crypto.github.io/loneliness-risk-decision-lab/survey</w:t>
         </w:r>
       </w:hyperlink>
     </w:p>

</xml_diff>

<commit_message>
Add LRDL-HHZ logo system
</commit_message>
<xml_diff>
--- a/docs/outputs/loneliness_risk_research_report.docx
+++ b/docs/outputs/loneliness_risk_research_report.docx
@@ -2,6 +2,45 @@
 <file path=word/document.xml><?xml version="1.0" encoding="utf-8"?>
 <w:document xmlns:wpc="http://schemas.microsoft.com/office/word/2010/wordprocessingCanvas" xmlns:mo="http://schemas.microsoft.com/office/mac/office/2008/main" xmlns:mc="http://schemas.openxmlformats.org/markup-compatibility/2006" xmlns:mv="urn:schemas-microsoft-com:mac:vml" xmlns:o="urn:schemas-microsoft-com:office:office" xmlns:r="http://schemas.openxmlformats.org/officeDocument/2006/relationships" xmlns:m="http://schemas.openxmlformats.org/officeDocument/2006/math" xmlns:v="urn:schemas-microsoft-com:vml" xmlns:wp14="http://schemas.microsoft.com/office/word/2010/wordprocessingDrawing" xmlns:wp="http://schemas.openxmlformats.org/drawingml/2006/wordprocessingDrawing" xmlns:w10="urn:schemas-microsoft-com:office:word" xmlns:w="http://schemas.openxmlformats.org/wordprocessingml/2006/main" xmlns:w14="http://schemas.microsoft.com/office/word/2010/wordml" xmlns:wpg="http://schemas.microsoft.com/office/word/2010/wordprocessingGroup" xmlns:wpi="http://schemas.microsoft.com/office/word/2010/wordprocessingInk" xmlns:wne="http://schemas.microsoft.com/office/word/2006/wordml" xmlns:wps="http://schemas.microsoft.com/office/word/2010/wordprocessingShape" mc:Ignorable="w14 wp14">
   <w:body>
+    <w:p>
+      <w:pPr>
+        <w:jc w:val="center"/>
+      </w:pPr>
+      <w:r>
+        <w:drawing>
+          <wp:inline xmlns:a="http://schemas.openxmlformats.org/drawingml/2006/main" xmlns:pic="http://schemas.openxmlformats.org/drawingml/2006/picture">
+            <wp:extent cx="3063240" cy="884936"/>
+            <wp:docPr id="1" name="Picture 1"/>
+            <wp:cNvGraphicFramePr>
+              <a:graphicFrameLocks noChangeAspect="1"/>
+            </wp:cNvGraphicFramePr>
+            <a:graphic>
+              <a:graphicData uri="http://schemas.openxmlformats.org/drawingml/2006/picture">
+                <pic:pic>
+                  <pic:nvPicPr>
+                    <pic:cNvPr id="0" name="lrdl_logo_lockup.png"/>
+                    <pic:cNvPicPr/>
+                  </pic:nvPicPr>
+                  <pic:blipFill>
+                    <a:blip r:embed="rId11"/>
+                    <a:stretch>
+                      <a:fillRect/>
+                    </a:stretch>
+                  </pic:blipFill>
+                  <pic:spPr>
+                    <a:xfrm>
+                      <a:off x="0" y="0"/>
+                      <a:ext cx="3063240" cy="884936"/>
+                    </a:xfrm>
+                    <a:prstGeom prst="rect"/>
+                  </pic:spPr>
+                </pic:pic>
+              </a:graphicData>
+            </a:graphic>
+          </wp:inline>
+        </w:drawing>
+      </w:r>
+    </w:p>
     <w:p>
       <w:pPr>
         <w:jc w:val="center"/>
@@ -175,6 +214,60 @@
                 <w:sz w:val="19"/>
               </w:rPr>
               <w:t>He Haoze (何昊泽)</w:t>
+            </w:r>
+          </w:p>
+        </w:tc>
+      </w:tr>
+      <w:tr>
+        <w:tc>
+          <w:tcPr>
+            <w:tcW w:type="dxa" w:w="2520"/>
+            <w:vAlign w:val="center"/>
+            <w:tcMar>
+              <w:top w:w="80" w:type="dxa"/>
+              <w:start w:w="120" w:type="dxa"/>
+              <w:bottom w:w="80" w:type="dxa"/>
+              <w:end w:w="120" w:type="dxa"/>
+            </w:tcMar>
+          </w:tcPr>
+          <w:p>
+            <w:pPr>
+              <w:spacing w:before="0" w:after="60" w:line="269" w:lineRule="auto"/>
+            </w:pPr>
+            <w:r>
+              <w:rPr>
+                <w:rFonts w:ascii="Calibri" w:hAnsi="Calibri"/>
+                <w:b w:val="0"/>
+                <w:color w:val="122033"/>
+                <w:sz w:val="19"/>
+              </w:rPr>
+              <w:t>Logo / IP mark</w:t>
+            </w:r>
+          </w:p>
+        </w:tc>
+        <w:tc>
+          <w:tcPr>
+            <w:tcW w:type="dxa" w:w="6840"/>
+            <w:vAlign w:val="center"/>
+            <w:tcMar>
+              <w:top w:w="80" w:type="dxa"/>
+              <w:start w:w="120" w:type="dxa"/>
+              <w:bottom w:w="80" w:type="dxa"/>
+              <w:end w:w="120" w:type="dxa"/>
+            </w:tcMar>
+          </w:tcPr>
+          <w:p>
+            <w:pPr>
+              <w:spacing w:before="0" w:after="60" w:line="269" w:lineRule="auto"/>
+            </w:pPr>
+            <w:r>
+              <w:rPr>
+                <w:rFonts w:ascii="Calibri" w:hAnsi="Calibri"/>
+                <w:b w:val="0"/>
+                <w:color w:val="122033"/>
+                <w:sz w:val="19"/>
+              </w:rPr>
+              <w:t>LRDL-HHZ Connection Lens</w:t>
             </w:r>
           </w:p>
         </w:tc>
@@ -1351,7 +1444,7 @@
         <w:drawing>
           <wp:inline xmlns:a="http://schemas.openxmlformats.org/drawingml/2006/main" xmlns:pic="http://schemas.openxmlformats.org/drawingml/2006/picture">
             <wp:extent cx="5577840" cy="3137535"/>
-            <wp:docPr id="1" name="Picture 1"/>
+            <wp:docPr id="2" name="Picture 2"/>
             <wp:cNvGraphicFramePr>
               <a:graphicFrameLocks noChangeAspect="1"/>
             </wp:cNvGraphicFramePr>
@@ -1363,7 +1456,7 @@
                     <pic:cNvPicPr/>
                   </pic:nvPicPr>
                   <pic:blipFill>
-                    <a:blip r:embed="rId11"/>
+                    <a:blip r:embed="rId12"/>
                     <a:stretch>
                       <a:fillRect/>
                     </a:stretch>
@@ -1773,7 +1866,7 @@
         <w:drawing>
           <wp:inline xmlns:a="http://schemas.openxmlformats.org/drawingml/2006/main" xmlns:pic="http://schemas.openxmlformats.org/drawingml/2006/picture">
             <wp:extent cx="5394960" cy="3348596"/>
-            <wp:docPr id="2" name="Picture 2"/>
+            <wp:docPr id="3" name="Picture 3"/>
             <wp:cNvGraphicFramePr>
               <a:graphicFrameLocks noChangeAspect="1"/>
             </wp:cNvGraphicFramePr>
@@ -1785,7 +1878,7 @@
                     <pic:cNvPicPr/>
                   </pic:nvPicPr>
                   <pic:blipFill>
-                    <a:blip r:embed="rId12"/>
+                    <a:blip r:embed="rId13"/>
                     <a:stretch>
                       <a:fillRect/>
                     </a:stretch>
@@ -1821,7 +1914,7 @@
         <w:drawing>
           <wp:inline xmlns:a="http://schemas.openxmlformats.org/drawingml/2006/main" xmlns:pic="http://schemas.openxmlformats.org/drawingml/2006/picture">
             <wp:extent cx="5394960" cy="3342447"/>
-            <wp:docPr id="3" name="Picture 3"/>
+            <wp:docPr id="4" name="Picture 4"/>
             <wp:cNvGraphicFramePr>
               <a:graphicFrameLocks noChangeAspect="1"/>
             </wp:cNvGraphicFramePr>
@@ -1833,7 +1926,7 @@
                     <pic:cNvPicPr/>
                   </pic:nvPicPr>
                   <pic:blipFill>
-                    <a:blip r:embed="rId13"/>
+                    <a:blip r:embed="rId14"/>
                     <a:stretch>
                       <a:fillRect/>
                     </a:stretch>
@@ -2860,7 +2953,7 @@
         <w:drawing>
           <wp:inline xmlns:a="http://schemas.openxmlformats.org/drawingml/2006/main" xmlns:pic="http://schemas.openxmlformats.org/drawingml/2006/picture">
             <wp:extent cx="5394960" cy="3344799"/>
-            <wp:docPr id="4" name="Picture 4"/>
+            <wp:docPr id="5" name="Picture 5"/>
             <wp:cNvGraphicFramePr>
               <a:graphicFrameLocks noChangeAspect="1"/>
             </wp:cNvGraphicFramePr>
@@ -2872,7 +2965,7 @@
                     <pic:cNvPicPr/>
                   </pic:nvPicPr>
                   <pic:blipFill>
-                    <a:blip r:embed="rId14"/>
+                    <a:blip r:embed="rId15"/>
                     <a:stretch>
                       <a:fillRect/>
                     </a:stretch>
@@ -2908,7 +3001,7 @@
         <w:drawing>
           <wp:inline xmlns:a="http://schemas.openxmlformats.org/drawingml/2006/main" xmlns:pic="http://schemas.openxmlformats.org/drawingml/2006/picture">
             <wp:extent cx="4846320" cy="3000427"/>
-            <wp:docPr id="5" name="Picture 5"/>
+            <wp:docPr id="6" name="Picture 6"/>
             <wp:cNvGraphicFramePr>
               <a:graphicFrameLocks noChangeAspect="1"/>
             </wp:cNvGraphicFramePr>
@@ -2920,7 +3013,7 @@
                     <pic:cNvPicPr/>
                   </pic:nvPicPr>
                   <pic:blipFill>
-                    <a:blip r:embed="rId15"/>
+                    <a:blip r:embed="rId16"/>
                     <a:stretch>
                       <a:fillRect/>
                     </a:stretch>
@@ -3447,7 +3540,7 @@
         </w:rPr>
         <w:t xml:space="preserve">Current public survey: </w:t>
       </w:r>
-      <w:hyperlink r:id="rId16">
+      <w:hyperlink r:id="rId17">
         <w:r>
           <w:rPr>
             <w:color w:val="1155CC"/>
@@ -3467,7 +3560,7 @@
         </w:rPr>
         <w:t xml:space="preserve">GitHub repository: </w:t>
       </w:r>
-      <w:hyperlink r:id="rId17">
+      <w:hyperlink r:id="rId18">
         <w:r>
           <w:rPr>
             <w:color w:val="1155CC"/>
@@ -3487,7 +3580,7 @@
         </w:rPr>
         <w:t xml:space="preserve">Render Blueprint: </w:t>
       </w:r>
-      <w:hyperlink r:id="rId18">
+      <w:hyperlink r:id="rId19">
         <w:r>
           <w:rPr>
             <w:color w:val="1155CC"/>
@@ -3734,7 +3827,54 @@
         <w:color w:val="555E6C"/>
         <w:sz w:val="18"/>
       </w:rPr>
-      <w:t>Loneliness &amp; Risk Decision Lab</w:t>
+    </w:r>
+    <w:r>
+      <w:rPr>
+        <w:rFonts w:ascii="Calibri" w:hAnsi="Calibri"/>
+        <w:color w:val="555E6C"/>
+        <w:sz w:val="18"/>
+      </w:rPr>
+      <w:drawing>
+        <wp:inline xmlns:a="http://schemas.openxmlformats.org/drawingml/2006/main" xmlns:pic="http://schemas.openxmlformats.org/drawingml/2006/picture">
+          <wp:extent cx="256032" cy="256032"/>
+          <wp:docPr id="1" name="Picture 1"/>
+          <wp:cNvGraphicFramePr>
+            <a:graphicFrameLocks noChangeAspect="1"/>
+          </wp:cNvGraphicFramePr>
+          <a:graphic>
+            <a:graphicData uri="http://schemas.openxmlformats.org/drawingml/2006/picture">
+              <pic:pic>
+                <pic:nvPicPr>
+                  <pic:cNvPr id="0" name="lrdl_logo_mark.png"/>
+                  <pic:cNvPicPr/>
+                </pic:nvPicPr>
+                <pic:blipFill>
+                  <a:blip r:embed="rId1"/>
+                  <a:stretch>
+                    <a:fillRect/>
+                  </a:stretch>
+                </pic:blipFill>
+                <pic:spPr>
+                  <a:xfrm>
+                    <a:off x="0" y="0"/>
+                    <a:ext cx="256032" cy="256032"/>
+                  </a:xfrm>
+                  <a:prstGeom prst="rect"/>
+                </pic:spPr>
+              </pic:pic>
+            </a:graphicData>
+          </a:graphic>
+        </wp:inline>
+      </w:drawing>
+    </w:r>
+    <w:r>
+      <w:rPr>
+        <w:rFonts w:ascii="Calibri" w:hAnsi="Calibri"/>
+        <w:b/>
+        <w:color w:val="555E6C"/>
+        <w:sz w:val="18"/>
+      </w:rPr>
+      <w:t xml:space="preserve">  Loneliness &amp; Risk Decision Lab | LRDL-HHZ</w:t>
     </w:r>
   </w:p>
 </w:hdr>

</xml_diff>